<commit_message>
updated README.md and CV document to reflect recent changes and improvements.
</commit_message>
<xml_diff>
--- a/assets/cv/OKAFOR_VICTOR_SOMTO_CV.docx
+++ b/assets/cv/OKAFOR_VICTOR_SOMTO_CV.docx
@@ -5,103 +5,97 @@
     <w:tbl>
       <w:tblPr>
         <w:tblW w:type="auto" w:w="0"/>
+        <w:jc w:val="center"/>
         <w:tblLayout w:type="fixed"/>
         <w:tblLook w:firstColumn="1" w:firstRow="1" w:lastColumn="0" w:lastRow="0" w:noHBand="0" w:noVBand="1" w:val="04A0"/>
+        <w:tblBorders>
+          <w:top w:val="nil"/>
+          <w:left w:val="nil"/>
+          <w:bottom w:val="nil"/>
+          <w:right w:val="nil"/>
+          <w:insideH w:val="nil"/>
+          <w:insideV w:val="nil"/>
+        </w:tblBorders>
       </w:tblPr>
       <w:tblGrid>
-        <w:gridCol w:w="8568"/>
-        <w:gridCol w:w="1944"/>
+        <w:gridCol w:w="8136"/>
+        <w:gridCol w:w="1656"/>
       </w:tblGrid>
       <w:tr>
         <w:tc>
           <w:tcPr>
-            <w:tcW w:type="dxa" w:w="8568"/>
-            <w:tcBorders>
-              <w:top w:val="nil"/>
-              <w:left w:val="nil"/>
-              <w:bottom w:val="nil"/>
-              <w:right w:val="nil"/>
-            </w:tcBorders>
+            <w:tcW w:type="dxa" w:w="8136"/>
+            <w:vAlign w:val="center"/>
           </w:tcPr>
           <w:p>
             <w:pPr>
-              <w:spacing w:after="0"/>
+              <w:spacing w:after="60"/>
+              <w:jc w:val="left"/>
             </w:pPr>
             <w:r>
               <w:rPr>
+                <w:rFonts w:ascii="Aptos Display" w:hAnsi="Aptos Display"/>
                 <w:b/>
-                <w:color w:val="14202C"/>
-                <w:sz w:val="42"/>
+                <w:color w:val="162033"/>
+                <w:sz w:val="40"/>
               </w:rPr>
-              <w:t>OKAFOR VICTOR SOMTO</w:t>
+              <w:t>VICTOR OKAFOR SOMTO</w:t>
             </w:r>
           </w:p>
           <w:p>
             <w:pPr>
-              <w:spacing w:before="0" w:after="80"/>
+              <w:spacing w:after="80"/>
             </w:pPr>
             <w:r>
               <w:rPr>
+                <w:rFonts w:ascii="Aptos" w:hAnsi="Aptos"/>
                 <w:b/>
-                <w:color w:val="1F4367"/>
-                <w:sz w:val="19"/>
+                <w:color w:val="2C5B80"/>
+                <w:sz w:val="20"/>
               </w:rPr>
-              <w:t>FULL-STACK DEVELOPER  •  AI-NATIVE SOFTWARE ENGINEER</w:t>
+              <w:t>FULL-STACK DEVELOPER | AI &amp; PRODUCT ENGINEERING</w:t>
             </w:r>
           </w:p>
           <w:p>
             <w:pPr>
-              <w:spacing w:before="0" w:after="16" w:line="240" w:lineRule="auto"/>
+              <w:spacing w:after="20"/>
             </w:pPr>
             <w:r>
               <w:rPr>
-                <w:sz w:val="16"/>
+                <w:rFonts w:ascii="Aptos" w:hAnsi="Aptos"/>
+                <w:color w:val="4B5563"/>
+                <w:sz w:val="17"/>
               </w:rPr>
-              <w:t>Nigeria  |  Victor4all2015@gmail.com  |  +234 812 291 1210</w:t>
+              <w:t>Nigeria • GitHub: Linxvicky2049 • LinkedIn: okafor-victor-2717783b4</w:t>
             </w:r>
           </w:p>
           <w:p>
             <w:pPr>
-              <w:spacing w:before="0" w:after="16" w:line="240" w:lineRule="auto"/>
+              <w:spacing w:after="20"/>
             </w:pPr>
             <w:r>
               <w:rPr>
-                <w:sz w:val="16"/>
+                <w:rFonts w:ascii="Aptos" w:hAnsi="Aptos"/>
+                <w:color w:val="4B5563"/>
+                <w:sz w:val="17"/>
               </w:rPr>
-              <w:t>GitHub: github.com/Linxvicky2049  |  LinkedIn: linkedin.com/in/okafor-victor-2717783b4</w:t>
-            </w:r>
-          </w:p>
-          <w:p>
-            <w:pPr>
-              <w:spacing w:before="0" w:after="16" w:line="240" w:lineRule="auto"/>
-            </w:pPr>
-            <w:r>
-              <w:rPr>
-                <w:sz w:val="16"/>
-              </w:rPr>
-              <w:t>Portfolio: linxvicky2049.github.io/portfolio-website/  |  Gaming-Africa: gaming-africa.com</w:t>
+              <w:t>Portfolio: linxvicky2049.github.io/blacksun-portfolio/</w:t>
             </w:r>
           </w:p>
         </w:tc>
         <w:tc>
           <w:tcPr>
-            <w:tcW w:type="dxa" w:w="1944"/>
+            <w:tcW w:type="dxa" w:w="1656"/>
             <w:vAlign w:val="center"/>
-            <w:tcBorders>
-              <w:top w:val="nil"/>
-              <w:left w:val="nil"/>
-              <w:bottom w:val="nil"/>
-              <w:right w:val="nil"/>
-            </w:tcBorders>
           </w:tcPr>
           <w:p>
             <w:pPr>
-              <w:jc w:val="center"/>
+              <w:jc w:val="right"/>
             </w:pPr>
             <w:r>
               <w:drawing>
                 <wp:inline xmlns:a="http://schemas.openxmlformats.org/drawingml/2006/main" xmlns:pic="http://schemas.openxmlformats.org/drawingml/2006/picture">
-                  <wp:extent cx="1143000" cy="1426464"/>
+                  <wp:extent cx="987552" cy="987552"/>
                   <wp:docPr id="1" name="Picture 1"/>
                   <wp:cNvGraphicFramePr>
                     <a:graphicFrameLocks noChangeAspect="1"/>
@@ -110,7 +104,7 @@
                     <a:graphicData uri="http://schemas.openxmlformats.org/drawingml/2006/picture">
                       <pic:pic>
                         <pic:nvPicPr>
-                          <pic:cNvPr id="0" name="victor_resume_photo.jpg"/>
+                          <pic:cNvPr id="0" name="Victor_Okafor_Professional_Headshot.jpg"/>
                           <pic:cNvPicPr/>
                         </pic:nvPicPr>
                         <pic:blipFill>
@@ -122,7 +116,7 @@
                         <pic:spPr>
                           <a:xfrm>
                             <a:off x="0" y="0"/>
-                            <a:ext cx="1143000" cy="1426464"/>
+                            <a:ext cx="987552" cy="987552"/>
                           </a:xfrm>
                           <a:prstGeom prst="rect"/>
                         </pic:spPr>
@@ -138,705 +132,248 @@
     </w:tbl>
     <w:p>
       <w:pPr>
-        <w:spacing w:after="0"/>
-      </w:pPr>
-    </w:p>
-    <w:p>
-      <w:pPr>
-        <w:keepNext/>
-        <w:spacing w:before="90" w:after="40"/>
-        <w:pBdr>
-          <w:bottom w:val="single" w:sz="6" w:space="1" w:color="B8C4D0"/>
-        </w:pBdr>
+        <w:spacing w:before="100" w:after="140"/>
       </w:pPr>
       <w:r>
         <w:rPr>
           <w:b/>
-          <w:color w:val="1F4367"/>
-          <w:sz w:val="19"/>
+          <w:color w:val="195073"/>
+          <w:sz w:val="20"/>
         </w:rPr>
-        <w:t>PROFESSIONAL SUMMARY</w:t>
+        <w:t>SUMMARY</w:t>
       </w:r>
     </w:p>
     <w:p>
       <w:pPr>
-        <w:spacing w:after="40" w:line="245" w:lineRule="auto"/>
+        <w:spacing w:after="40"/>
       </w:pPr>
       <w:r>
-        <w:t>Full-stack developer and creative technologist experienced in building modern web applications, APIs, AI-assisted systems and interactive interfaces. Strong working knowledge of TypeScript, JavaScript, React, Next.js, Node.js and Python, with practical experience integrating APIs, databases, authentication and complex product workflows. Comfortable using AI-assisted development for implementation, debugging, refactoring, documentation and problem solving while reviewing and validating generated code.</w:t>
+        <w:t>Full-stack developer and AI-focused creative technologist with a Physics degree and hands-on experience building web products, APIs, and AI-enabled prototypes. Works across React, TypeScript, Node.js, Python, FastAPI, MongoDB, Firebase, and Supabase, with a product-oriented approach to turning ideas into usable software. Interested in SaaS products, operational automation, AI-assisted workflows, and reliable integrations.</w:t>
       </w:r>
     </w:p>
     <w:p>
       <w:pPr>
-        <w:keepNext/>
-        <w:spacing w:before="90" w:after="40"/>
-        <w:pBdr>
-          <w:bottom w:val="single" w:sz="6" w:space="1" w:color="B8C4D0"/>
-        </w:pBdr>
+        <w:spacing w:before="100" w:after="40"/>
       </w:pPr>
       <w:r>
         <w:rPr>
           <w:b/>
-          <w:color w:val="1F4367"/>
-          <w:sz w:val="19"/>
+          <w:color w:val="195073"/>
+          <w:sz w:val="20"/>
         </w:rPr>
         <w:t>TECHNICAL SKILLS</w:t>
       </w:r>
     </w:p>
-    <w:tbl>
-      <w:tblPr>
-        <w:tblW w:type="auto" w:w="0"/>
-        <w:tblLayout w:type="fixed"/>
-        <w:tblLook w:firstColumn="1" w:firstRow="1" w:lastColumn="0" w:lastRow="0" w:noHBand="0" w:noVBand="1" w:val="04A0"/>
-      </w:tblPr>
-      <w:tblGrid>
-        <w:gridCol w:w="1944"/>
-        <w:gridCol w:w="8568"/>
-      </w:tblGrid>
-      <w:tr>
-        <w:tc>
-          <w:tcPr>
-            <w:tcW w:type="dxa" w:w="1944"/>
-            <w:vAlign w:val="center"/>
-            <w:tcBorders>
-              <w:bottom w:val="single" w:sz="2" w:color="E5E9ED"/>
-            </w:tcBorders>
-          </w:tcPr>
-          <w:p>
-            <w:pPr>
-              <w:spacing w:after="20"/>
-            </w:pPr>
-            <w:r>
-              <w:rPr>
-                <w:b/>
-                <w:color w:val="1F4367"/>
-                <w:sz w:val="16"/>
-              </w:rPr>
-              <w:t>Frontend</w:t>
-            </w:r>
-          </w:p>
-        </w:tc>
-        <w:tc>
-          <w:tcPr>
-            <w:tcW w:type="dxa" w:w="8568"/>
-            <w:vAlign w:val="center"/>
-            <w:tcBorders>
-              <w:bottom w:val="single" w:sz="2" w:color="E5E9ED"/>
-            </w:tcBorders>
-          </w:tcPr>
-          <w:p>
-            <w:pPr>
-              <w:spacing w:after="20"/>
-            </w:pPr>
-            <w:r>
-              <w:rPr>
-                <w:sz w:val="16"/>
-              </w:rPr>
-              <w:t>React, Next.js, TypeScript, JavaScript, HTML, CSS, Responsive UI, Figma</w:t>
-            </w:r>
-          </w:p>
-        </w:tc>
-      </w:tr>
-      <w:tr>
-        <w:tc>
-          <w:tcPr>
-            <w:tcW w:type="dxa" w:w="1944"/>
-            <w:vAlign w:val="center"/>
-            <w:tcBorders>
-              <w:bottom w:val="single" w:sz="2" w:color="E5E9ED"/>
-            </w:tcBorders>
-          </w:tcPr>
-          <w:p>
-            <w:pPr>
-              <w:spacing w:after="20"/>
-            </w:pPr>
-            <w:r>
-              <w:rPr>
-                <w:b/>
-                <w:color w:val="1F4367"/>
-                <w:sz w:val="16"/>
-              </w:rPr>
-              <w:t>Backend</w:t>
-            </w:r>
-          </w:p>
-        </w:tc>
-        <w:tc>
-          <w:tcPr>
-            <w:tcW w:type="dxa" w:w="8568"/>
-            <w:vAlign w:val="center"/>
-            <w:tcBorders>
-              <w:bottom w:val="single" w:sz="2" w:color="E5E9ED"/>
-            </w:tcBorders>
-          </w:tcPr>
-          <w:p>
-            <w:pPr>
-              <w:spacing w:after="20"/>
-            </w:pPr>
-            <w:r>
-              <w:rPr>
-                <w:sz w:val="16"/>
-              </w:rPr>
-              <w:t>Node.js, Express.js, Python, FastAPI, REST APIs, Authentication, API Design</w:t>
-            </w:r>
-          </w:p>
-        </w:tc>
-      </w:tr>
-      <w:tr>
-        <w:tc>
-          <w:tcPr>
-            <w:tcW w:type="dxa" w:w="1944"/>
-            <w:vAlign w:val="center"/>
-            <w:tcBorders>
-              <w:bottom w:val="single" w:sz="2" w:color="E5E9ED"/>
-            </w:tcBorders>
-          </w:tcPr>
-          <w:p>
-            <w:pPr>
-              <w:spacing w:after="20"/>
-            </w:pPr>
-            <w:r>
-              <w:rPr>
-                <w:b/>
-                <w:color w:val="1F4367"/>
-                <w:sz w:val="16"/>
-              </w:rPr>
-              <w:t>Databases</w:t>
-            </w:r>
-          </w:p>
-        </w:tc>
-        <w:tc>
-          <w:tcPr>
-            <w:tcW w:type="dxa" w:w="8568"/>
-            <w:vAlign w:val="center"/>
-            <w:tcBorders>
-              <w:bottom w:val="single" w:sz="2" w:color="E5E9ED"/>
-            </w:tcBorders>
-          </w:tcPr>
-          <w:p>
-            <w:pPr>
-              <w:spacing w:after="20"/>
-            </w:pPr>
-            <w:r>
-              <w:rPr>
-                <w:sz w:val="16"/>
-              </w:rPr>
-              <w:t>MongoDB, PostgreSQL, Prisma</w:t>
-            </w:r>
-          </w:p>
-        </w:tc>
-      </w:tr>
-      <w:tr>
-        <w:tc>
-          <w:tcPr>
-            <w:tcW w:type="dxa" w:w="1944"/>
-            <w:vAlign w:val="center"/>
-            <w:tcBorders>
-              <w:bottom w:val="single" w:sz="2" w:color="E5E9ED"/>
-            </w:tcBorders>
-          </w:tcPr>
-          <w:p>
-            <w:pPr>
-              <w:spacing w:after="20"/>
-            </w:pPr>
-            <w:r>
-              <w:rPr>
-                <w:b/>
-                <w:color w:val="1F4367"/>
-                <w:sz w:val="16"/>
-              </w:rPr>
-              <w:t>AI &amp; Intelligent Systems</w:t>
-            </w:r>
-          </w:p>
-        </w:tc>
-        <w:tc>
-          <w:tcPr>
-            <w:tcW w:type="dxa" w:w="8568"/>
-            <w:vAlign w:val="center"/>
-            <w:tcBorders>
-              <w:bottom w:val="single" w:sz="2" w:color="E5E9ED"/>
-            </w:tcBorders>
-          </w:tcPr>
-          <w:p>
-            <w:pPr>
-              <w:spacing w:after="20"/>
-            </w:pPr>
-            <w:r>
-              <w:rPr>
-                <w:sz w:val="16"/>
-              </w:rPr>
-              <w:t>AI-assisted development, PyTorch, Computer Vision, OCR, AI workflows</w:t>
-            </w:r>
-          </w:p>
-        </w:tc>
-      </w:tr>
-      <w:tr>
-        <w:tc>
-          <w:tcPr>
-            <w:tcW w:type="dxa" w:w="1944"/>
-            <w:vAlign w:val="center"/>
-            <w:tcBorders>
-              <w:bottom w:val="single" w:sz="2" w:color="E5E9ED"/>
-            </w:tcBorders>
-          </w:tcPr>
-          <w:p>
-            <w:pPr>
-              <w:spacing w:after="20"/>
-            </w:pPr>
-            <w:r>
-              <w:rPr>
-                <w:b/>
-                <w:color w:val="1F4367"/>
-                <w:sz w:val="16"/>
-              </w:rPr>
-              <w:t>Engineering</w:t>
-            </w:r>
-          </w:p>
-        </w:tc>
-        <w:tc>
-          <w:tcPr>
-            <w:tcW w:type="dxa" w:w="8568"/>
-            <w:vAlign w:val="center"/>
-            <w:tcBorders>
-              <w:bottom w:val="single" w:sz="2" w:color="E5E9ED"/>
-            </w:tcBorders>
-          </w:tcPr>
-          <w:p>
-            <w:pPr>
-              <w:spacing w:after="20"/>
-            </w:pPr>
-            <w:r>
-              <w:rPr>
-                <w:sz w:val="16"/>
-              </w:rPr>
-              <w:t>Git, GitHub, Debugging, API Testing, Software Architecture, Environment Configuration</w:t>
-            </w:r>
-          </w:p>
-        </w:tc>
-      </w:tr>
-      <w:tr>
-        <w:tc>
-          <w:tcPr>
-            <w:tcW w:type="dxa" w:w="1944"/>
-            <w:vAlign w:val="center"/>
-            <w:tcBorders>
-              <w:bottom w:val="single" w:sz="2" w:color="E5E9ED"/>
-            </w:tcBorders>
-          </w:tcPr>
-          <w:p>
-            <w:pPr>
-              <w:spacing w:after="20"/>
-            </w:pPr>
-            <w:r>
-              <w:rPr>
-                <w:b/>
-                <w:color w:val="1F4367"/>
-                <w:sz w:val="16"/>
-              </w:rPr>
-              <w:t>IoT</w:t>
-            </w:r>
-          </w:p>
-        </w:tc>
-        <w:tc>
-          <w:tcPr>
-            <w:tcW w:type="dxa" w:w="8568"/>
-            <w:vAlign w:val="center"/>
-            <w:tcBorders>
-              <w:bottom w:val="single" w:sz="2" w:color="E5E9ED"/>
-            </w:tcBorders>
-          </w:tcPr>
-          <w:p>
-            <w:pPr>
-              <w:spacing w:after="20"/>
-            </w:pPr>
-            <w:r>
-              <w:rPr>
-                <w:sz w:val="16"/>
-              </w:rPr>
-              <w:t>ESP32-S3, WiFi CSI, Signal Processing, Hardware-Software Integration</w:t>
-            </w:r>
-          </w:p>
-        </w:tc>
-      </w:tr>
-    </w:tbl>
     <w:p>
       <w:pPr>
-        <w:keepNext/>
-        <w:spacing w:before="90" w:after="40"/>
-        <w:pBdr>
-          <w:bottom w:val="single" w:sz="6" w:space="1" w:color="B8C4D0"/>
-        </w:pBdr>
+        <w:spacing w:after="40"/>
+      </w:pPr>
+      <w:r>
+        <w:t>Frontend: React, Next.js, TypeScript, JavaScript, Vite, responsive UI development, interactive interfaces.</w:t>
+      </w:r>
+    </w:p>
+    <w:p>
+      <w:pPr>
+        <w:spacing w:after="40"/>
+      </w:pPr>
+      <w:r>
+        <w:t>Backend: Node.js, Express, Python, FastAPI, REST APIs, authentication and application workflows.</w:t>
+      </w:r>
+    </w:p>
+    <w:p>
+      <w:pPr>
+        <w:spacing w:after="40"/>
+      </w:pPr>
+      <w:r>
+        <w:t>Data &amp; services: MongoDB, PostgreSQL, Firebase, Supabase, API integrations, Cloudinary, Git/GitHub.</w:t>
+      </w:r>
+    </w:p>
+    <w:p>
+      <w:pPr>
+        <w:spacing w:after="40"/>
+      </w:pPr>
+      <w:r>
+        <w:t>AI &amp; automation: PyTorch, computer vision, OCR, signal processing, rule-based automation, AI-assisted product concepts.</w:t>
+      </w:r>
+    </w:p>
+    <w:p>
+      <w:pPr>
+        <w:spacing w:after="40"/>
+      </w:pPr>
+      <w:r>
+        <w:t>Product engineering: end-to-end prototyping, debugging, interface design, deployment workflows, technical documentation, iterative development.</w:t>
+      </w:r>
+    </w:p>
+    <w:p>
+      <w:pPr>
+        <w:spacing w:before="100" w:after="40"/>
       </w:pPr>
       <w:r>
         <w:rPr>
           <w:b/>
-          <w:color w:val="1F4367"/>
-          <w:sz w:val="19"/>
+          <w:color w:val="195073"/>
+          <w:sz w:val="20"/>
         </w:rPr>
         <w:t>SELECTED PROJECTS</w:t>
       </w:r>
     </w:p>
     <w:p>
       <w:pPr>
-        <w:keepNext/>
-        <w:spacing w:before="46" w:after="12"/>
-      </w:pPr>
-      <w:r>
-        <w:rPr>
-          <w:b/>
-          <w:color w:val="191919"/>
-          <w:sz w:val="18"/>
-        </w:rPr>
-        <w:t>BIZBUYSELL</w:t>
-      </w:r>
-      <w:r>
-        <w:rPr>
-          <w:i/>
-          <w:color w:val="5A5A5A"/>
-          <w:sz w:val="16"/>
-        </w:rPr>
-        <w:t xml:space="preserve">  |  Luxury Interior Marketplace  |  Next.js, TypeScript, PostgreSQL, Prisma</w:t>
-      </w:r>
-    </w:p>
-    <w:p>
-      <w:pPr>
-        <w:spacing w:after="16" w:line="240" w:lineRule="auto"/>
-        <w:ind w:left="216" w:hanging="158"/>
+        <w:spacing w:after="40"/>
       </w:pPr>
       <w:r>
         <w:rPr>
           <w:b/>
         </w:rPr>
-        <w:t xml:space="preserve">• </w:t>
+        <w:t xml:space="preserve">BREAK.app | </w:t>
       </w:r>
       <w:r>
-        <w:t>Developing a full-stack marketplace connecting customers with interior designers, furniture sellers and service providers.</w:t>
+        <w:t>Food delivery platform. MERN-based food ordering experience designed around customers, restaurants, and riders. Work spans React/Vite frontend flows, Express APIs, MongoDB-backed data, deployment, and interface refinement. Relevant to marketplace workflows and operational dashboards.</w:t>
       </w:r>
     </w:p>
     <w:p>
       <w:pPr>
-        <w:spacing w:after="16" w:line="240" w:lineRule="auto"/>
-        <w:ind w:left="216" w:hanging="158"/>
+        <w:spacing w:after="40"/>
       </w:pPr>
       <w:r>
         <w:rPr>
           <w:b/>
         </w:rPr>
-        <w:t xml:space="preserve">• </w:t>
+        <w:t xml:space="preserve">Gaming Hub Africa | </w:t>
       </w:r>
       <w:r>
-        <w:t>Designed workflows covering authentication, products, sellers, cart, checkout, orders, quotes, messaging and delivery.</w:t>
+        <w:t>Gaming platform. React and TypeScript frontend with Express, MongoDB, and Firebase services. Product work spans application flows, API integration, authentication-related issues, and responsive UI.</w:t>
       </w:r>
     </w:p>
     <w:p>
       <w:pPr>
-        <w:spacing w:after="16" w:line="240" w:lineRule="auto"/>
-        <w:ind w:left="216" w:hanging="158"/>
+        <w:spacing w:after="40"/>
       </w:pPr>
       <w:r>
         <w:rPr>
           <w:b/>
         </w:rPr>
-        <w:t xml:space="preserve">• </w:t>
+        <w:t xml:space="preserve">Digital Banking Backend | </w:t>
       </w:r>
       <w:r>
-        <w:t>Worked across frontend, backend, database and product-flow requirements using reusable application architecture.</w:t>
+        <w:t>API engineering. Node.js and MongoDB backend project covering customer onboarding, account rules, validation, and banking workflow endpoints. Relevant to data integrity and reliable backend logic.</w:t>
       </w:r>
     </w:p>
     <w:p>
       <w:pPr>
-        <w:keepNext/>
-        <w:spacing w:before="46" w:after="12"/>
-      </w:pPr>
-      <w:r>
-        <w:rPr>
-          <w:b/>
-          <w:color w:val="191919"/>
-          <w:sz w:val="18"/>
-        </w:rPr>
-        <w:t>GAMING HUB AFRICA</w:t>
-      </w:r>
-      <w:r>
-        <w:rPr>
-          <w:i/>
-          <w:color w:val="5A5A5A"/>
-          <w:sz w:val="16"/>
-        </w:rPr>
-        <w:t xml:space="preserve">  |  Gaming Platform  |  React, TypeScript, Node.js, MongoDB, Firebase</w:t>
-      </w:r>
-    </w:p>
-    <w:p>
-      <w:pPr>
-        <w:spacing w:after="16" w:line="240" w:lineRule="auto"/>
-        <w:ind w:left="216" w:hanging="158"/>
+        <w:spacing w:after="40"/>
       </w:pPr>
       <w:r>
         <w:rPr>
           <w:b/>
         </w:rPr>
-        <w:t xml:space="preserve">• </w:t>
+        <w:t xml:space="preserve">KageFlow | </w:t>
       </w:r>
       <w:r>
-        <w:t>Built a gaming-focused platform with authentication, profiles, community features and platform workflows.</w:t>
+        <w:t>AI manga motion reconstruction. Experimental system combining OCR, rule-based motion compilation, and Pixi.js rendering. Demonstrates integrating AI/computer-vision concepts with interactive software.</w:t>
       </w:r>
     </w:p>
     <w:p>
       <w:pPr>
-        <w:spacing w:after="16" w:line="240" w:lineRule="auto"/>
-        <w:ind w:left="216" w:hanging="158"/>
+        <w:spacing w:after="40"/>
       </w:pPr>
       <w:r>
         <w:rPr>
           <w:b/>
         </w:rPr>
-        <w:t xml:space="preserve">• </w:t>
+        <w:t xml:space="preserve">SenseGrid | </w:t>
       </w:r>
       <w:r>
-        <w:t>Developed responsive interfaces and integrated frontend services with backend APIs and databases.</w:t>
+        <w:t>Wireless sensing research. ESP32-S3 and Wi-Fi CSI project exploring presence and fall detection using signal processing, filtering, and FFT analysis.</w:t>
       </w:r>
     </w:p>
     <w:p>
       <w:pPr>
-        <w:spacing w:after="16" w:line="240" w:lineRule="auto"/>
-        <w:ind w:left="216" w:hanging="158"/>
+        <w:spacing w:before="100" w:after="40"/>
       </w:pPr>
       <w:r>
         <w:rPr>
           <w:b/>
+          <w:color w:val="195073"/>
+          <w:sz w:val="20"/>
         </w:rPr>
-        <w:t xml:space="preserve">• </w:t>
-      </w:r>
-      <w:r>
-        <w:t>Worked on deployment, environment configuration and application debugging.</w:t>
+        <w:t>ENGINEERING APPROACH</w:t>
       </w:r>
     </w:p>
     <w:p>
       <w:pPr>
-        <w:keepNext/>
-        <w:spacing w:before="46" w:after="12"/>
+        <w:spacing w:after="40"/>
+      </w:pPr>
+      <w:r>
+        <w:t>Comfortable moving between frontend experience, backend logic, data models, and integrations. Values small, testable steps, clear documentation, user-oriented problem solving, and learning from failures. Interested in measuring whether features solve the underlying problem rather than treating implementation as the finish line.</w:t>
+      </w:r>
+    </w:p>
+    <w:p>
+      <w:pPr>
+        <w:spacing w:before="100" w:after="40"/>
       </w:pPr>
       <w:r>
         <w:rPr>
           <w:b/>
-          <w:color w:val="191919"/>
-          <w:sz w:val="18"/>
-        </w:rPr>
-        <w:t>KAGEFLOW AI</w:t>
-      </w:r>
-      <w:r>
-        <w:rPr>
-          <w:i/>
-          <w:color w:val="5A5A5A"/>
-          <w:sz w:val="16"/>
-        </w:rPr>
-        <w:t xml:space="preserve">  |  AI Manga Motion System  |  React, TypeScript, Pixi.js, OCR, AI</w:t>
-      </w:r>
-    </w:p>
-    <w:p>
-      <w:pPr>
-        <w:spacing w:after="16" w:line="240" w:lineRule="auto"/>
-        <w:ind w:left="216" w:hanging="158"/>
-      </w:pPr>
-      <w:r>
-        <w:rPr>
-          <w:b/>
-        </w:rPr>
-        <w:t xml:space="preserve">• </w:t>
-      </w:r>
-      <w:r>
-        <w:t>Developed an experimental system for converting manga/comic imagery into animated motion sequences.</w:t>
-      </w:r>
-    </w:p>
-    <w:p>
-      <w:pPr>
-        <w:spacing w:after="16" w:line="240" w:lineRule="auto"/>
-        <w:ind w:left="216" w:hanging="158"/>
-      </w:pPr>
-      <w:r>
-        <w:rPr>
-          <w:b/>
-        </w:rPr>
-        <w:t xml:space="preserve">• </w:t>
-      </w:r>
-      <w:r>
-        <w:t>Designed a pipeline combining OCR, rule-based motion compilation and interactive Pixi.js playback.</w:t>
-      </w:r>
-    </w:p>
-    <w:p>
-      <w:pPr>
-        <w:spacing w:after="16" w:line="240" w:lineRule="auto"/>
-        <w:ind w:left="216" w:hanging="158"/>
-      </w:pPr>
-      <w:r>
-        <w:rPr>
-          <w:b/>
-        </w:rPr>
-        <w:t xml:space="preserve">• </w:t>
-      </w:r>
-      <w:r>
-        <w:t>Used AI-assisted development to explore implementation strategies, debug issues and accelerate development.</w:t>
-      </w:r>
-    </w:p>
-    <w:p>
-      <w:pPr>
-        <w:keepNext/>
-        <w:spacing w:before="46" w:after="12"/>
-      </w:pPr>
-      <w:r>
-        <w:rPr>
-          <w:b/>
-          <w:color w:val="191919"/>
-          <w:sz w:val="18"/>
-        </w:rPr>
-        <w:t>SENSEGRID</w:t>
-      </w:r>
-      <w:r>
-        <w:rPr>
-          <w:i/>
-          <w:color w:val="5A5A5A"/>
-          <w:sz w:val="16"/>
-        </w:rPr>
-        <w:t xml:space="preserve">  |  IoT Presence &amp; Fall Detection  |  Python, ESP32-S3, Signal Processing</w:t>
-      </w:r>
-    </w:p>
-    <w:p>
-      <w:pPr>
-        <w:spacing w:after="16" w:line="240" w:lineRule="auto"/>
-        <w:ind w:left="216" w:hanging="158"/>
-      </w:pPr>
-      <w:r>
-        <w:rPr>
-          <w:b/>
-        </w:rPr>
-        <w:t xml:space="preserve">• </w:t>
-      </w:r>
-      <w:r>
-        <w:t>Developed an experimental WiFi CSI-based sensing system using ESP32-S3 devices.</w:t>
-      </w:r>
-    </w:p>
-    <w:p>
-      <w:pPr>
-        <w:spacing w:after="16" w:line="240" w:lineRule="auto"/>
-        <w:ind w:left="216" w:hanging="158"/>
-      </w:pPr>
-      <w:r>
-        <w:rPr>
-          <w:b/>
-        </w:rPr>
-        <w:t xml:space="preserve">• </w:t>
-      </w:r>
-      <w:r>
-        <w:t>Applied Savitzky-Golay filtering, Butterworth filtering and FFT-based signal analysis.</w:t>
-      </w:r>
-    </w:p>
-    <w:p>
-      <w:pPr>
-        <w:keepNext/>
-        <w:spacing w:before="90" w:after="40"/>
-        <w:pBdr>
-          <w:bottom w:val="single" w:sz="6" w:space="1" w:color="B8C4D0"/>
-        </w:pBdr>
-      </w:pPr>
-      <w:r>
-        <w:rPr>
-          <w:b/>
-          <w:color w:val="1F4367"/>
-          <w:sz w:val="19"/>
-        </w:rPr>
-        <w:t>CREATIVE &amp; DESIGN EXPERIENCE</w:t>
-      </w:r>
-    </w:p>
-    <w:p>
-      <w:pPr>
-        <w:spacing w:after="30"/>
-      </w:pPr>
-      <w:r>
-        <w:t>Freelance graphic designer through BLACKSUN, creating logos, brand graphics, flyers, banners, business cards and AI-assisted visual content. Use Canva and Figma to create visual systems and user-facing digital experiences.</w:t>
-      </w:r>
-    </w:p>
-    <w:p>
-      <w:pPr>
-        <w:keepNext/>
-        <w:spacing w:before="90" w:after="40"/>
-        <w:pBdr>
-          <w:bottom w:val="single" w:sz="6" w:space="1" w:color="B8C4D0"/>
-        </w:pBdr>
-      </w:pPr>
-      <w:r>
-        <w:rPr>
-          <w:b/>
-          <w:color w:val="1F4367"/>
-          <w:sz w:val="19"/>
+          <w:color w:val="195073"/>
+          <w:sz w:val="20"/>
         </w:rPr>
         <w:t>EDUCATION</w:t>
       </w:r>
     </w:p>
     <w:p>
       <w:pPr>
-        <w:spacing w:after="30"/>
+        <w:spacing w:after="40"/>
+      </w:pPr>
+      <w:r>
+        <w:t>B.Sc. Physics | Federal University of Petroleum Resources Effurun (FUPRE), Warri, Nigeria.</w:t>
+      </w:r>
+    </w:p>
+    <w:p>
+      <w:pPr>
+        <w:spacing w:before="100" w:after="40"/>
       </w:pPr>
       <w:r>
         <w:rPr>
           <w:b/>
+          <w:color w:val="195073"/>
+          <w:sz w:val="20"/>
         </w:rPr>
-        <w:t>B.Sc. Physics</w:t>
-      </w:r>
-      <w:r>
-        <w:t xml:space="preserve">  |  Federal University of Petroleum Resources Effurun (FUPRE), Nigeria</w:t>
+        <w:t>LINKS</w:t>
       </w:r>
     </w:p>
     <w:p>
       <w:pPr>
-        <w:keepNext/>
-        <w:spacing w:before="90" w:after="40"/>
-        <w:pBdr>
-          <w:bottom w:val="single" w:sz="6" w:space="1" w:color="B8C4D0"/>
-        </w:pBdr>
+        <w:spacing w:after="40"/>
       </w:pPr>
       <w:r>
-        <w:rPr>
-          <w:b/>
-          <w:color w:val="1F4367"/>
-          <w:sz w:val="19"/>
-        </w:rPr>
-        <w:t>ADDITIONAL STRENGTHS</w:t>
+        <w:t>Portfolio: https://linxvicky2049.github.io/blacksun-portfolio/</w:t>
       </w:r>
     </w:p>
     <w:p>
       <w:pPr>
-        <w:spacing w:after="0"/>
+        <w:spacing w:after="40"/>
       </w:pPr>
       <w:r>
-        <w:t>Independent problem solving  •  AI-native development mindset  •  Fast learner  •  Git/GitHub workflows  •  Cross-functional frontend/backend thinking  •  Strong interest in software quality, testing and production engineering</w:t>
+        <w:t>GitHub: https://github.com/Linxvicky2049</w:t>
+      </w:r>
+    </w:p>
+    <w:p>
+      <w:pPr>
+        <w:spacing w:after="40"/>
+      </w:pPr>
+      <w:r>
+        <w:t>LinkedIn: https://www.linkedin.com/in/okafor-victor-2717783b4</w:t>
       </w:r>
     </w:p>
     <w:sectPr>
-      <w:footerReference w:type="default" r:id="rId10"/>
       <w:pgSz w:w="12240" w:h="15840"/>
-      <w:pgMar w:top="605" w:right="835" w:bottom="605" w:left="835" w:header="720" w:footer="720" w:gutter="0"/>
+      <w:pgMar w:top="792" w:right="979" w:bottom="792" w:left="979" w:header="720" w:footer="720" w:gutter="0"/>
       <w:cols w:space="720"/>
       <w:docGrid w:linePitch="360"/>
     </w:sectPr>
   </w:body>
 </w:document>
-</file>
-
-<file path=word/footer1.xml><?xml version="1.0" encoding="utf-8"?>
-<w:ftr xmlns:m="http://schemas.openxmlformats.org/officeDocument/2006/math" xmlns:mc="http://schemas.openxmlformats.org/markup-compatibility/2006" xmlns:mo="http://schemas.microsoft.com/office/mac/office/2008/main" xmlns:mv="urn:schemas-microsoft-com:mac:vml" xmlns:o="urn:schemas-microsoft-com:office:office" xmlns:r="http://schemas.openxmlformats.org/officeDocument/2006/relationships" xmlns:v="urn:schemas-microsoft-com:vml" xmlns:w10="urn:schemas-microsoft-com:office:word" xmlns:w14="http://schemas.microsoft.com/office/word/2010/wordml" xmlns:w="http://schemas.openxmlformats.org/wordprocessingml/2006/main" xmlns:wne="http://schemas.microsoft.com/office/word/2006/wordml" xmlns:wp14="http://schemas.microsoft.com/office/word/2010/wordprocessingDrawing" xmlns:wp="http://schemas.openxmlformats.org/drawingml/2006/wordprocessingDrawing" xmlns:wpc="http://schemas.microsoft.com/office/word/2010/wordprocessingCanvas" xmlns:wpg="http://schemas.microsoft.com/office/word/2010/wordprocessingGroup" xmlns:wpi="http://schemas.microsoft.com/office/word/2010/wordprocessingInk" xmlns:wps="http://schemas.microsoft.com/office/word/2010/wordprocessingShape" mc:Ignorable="w14 wp14">
-  <w:p>
-    <w:pPr>
-      <w:pStyle w:val="Footer"/>
-      <w:spacing w:before="40"/>
-      <w:jc w:val="center"/>
-    </w:pPr>
-    <w:r>
-      <w:rPr>
-        <w:color w:val="787878"/>
-        <w:sz w:val="14"/>
-      </w:rPr>
-      <w:t>OKAFOR VICTOR SOMTO  •  Full-Stack Developer &amp; AI-Native Software Engineer</w:t>
-    </w:r>
-  </w:p>
-</w:ftr>
 </file>
 
 <file path=word/numbering.xml><?xml version="1.0" encoding="utf-8"?>
@@ -1202,10 +739,13 @@
     <w:name w:val="Normal"/>
     <w:qFormat/>
     <w:rsid w:val="00FC693F"/>
+    <w:pPr>
+      <w:spacing w:after="60"/>
+    </w:pPr>
     <w:rPr>
       <w:rFonts w:ascii="Aptos" w:hAnsi="Aptos"/>
-      <w:color w:val="2D2D2D"/>
-      <w:sz w:val="17"/>
+      <w:color w:val="2D343C"/>
+      <w:sz w:val="18"/>
     </w:rPr>
   </w:style>
   <w:style w:type="paragraph" w:styleId="Header">

</xml_diff>